<commit_message>
Finalize project documentation and presentation by completing the business rules, data sources, data treatment, supporting tables, KPI definitions, methodological notes, dashboard storytelling, key EDA insights, and actionable commercial recommendations for the BanVic Data Analytics project.
</commit_message>
<xml_diff>
--- a/docs/Desafio Indicium AI - BanVic Dashboard e Storytelling - Luiz Eduardo Ferreira.docx
+++ b/docs/Desafio Indicium AI - BanVic Dashboard e Storytelling - Luiz Eduardo Ferreira.docx
@@ -15,6 +15,7 @@
           <w:lang w:val="en-US"/>
         </w:rPr>
       </w:pPr>
+      <w:proofErr w:type="spellStart"/>
       <w:r>
         <w:rPr>
           <w:rFonts w:ascii="Times New Roman" w:hAnsi="Times New Roman" w:cs="Times New Roman"/>
@@ -24,6 +25,7 @@
         </w:rPr>
         <w:t>Projeto</w:t>
       </w:r>
+      <w:proofErr w:type="spellEnd"/>
       <w:r>
         <w:rPr>
           <w:rFonts w:ascii="Times New Roman" w:hAnsi="Times New Roman" w:cs="Times New Roman"/>
@@ -243,17 +245,7 @@
           <w:b/>
           <w:bCs/>
         </w:rPr>
-        <w:t xml:space="preserve">definidas no </w:t>
-      </w:r>
-      <w:r>
-        <w:rPr>
-          <w:rFonts w:ascii="Times New Roman" w:hAnsi="Times New Roman" w:cs="Times New Roman"/>
-          <w:b/>
-          <w:bCs/>
-          <w:i/>
-          <w:iCs/>
-        </w:rPr>
-        <w:t>mockup</w:t>
+        <w:t>definidas</w:t>
       </w:r>
     </w:p>
     <w:p>
@@ -274,10 +266,8 @@
       <w:r>
         <w:rPr>
           <w:rFonts w:ascii="Times New Roman" w:hAnsi="Times New Roman" w:cs="Times New Roman"/>
-          <w:i/>
-          <w:iCs/>
-        </w:rPr>
-        <w:t>Mockup</w:t>
+        </w:rPr>
+        <w:t>Croqui</w:t>
       </w:r>
       <w:r>
         <w:rPr>
@@ -760,11 +750,13 @@
       <w:r>
         <w:rPr>
           <w:rFonts w:ascii="Times New Roman" w:hAnsi="Times New Roman" w:cs="Times New Roman"/>
+          <w:i w:val="0"/>
+          <w:iCs w:val="0"/>
           <w:color w:val="000000" w:themeColor="text1"/>
           <w:sz w:val="20"/>
           <w:szCs w:val="20"/>
         </w:rPr>
-        <w:t>Mockup</w:t>
+        <w:t>Croqui</w:t>
       </w:r>
       <w:r>
         <w:rPr>
@@ -962,8 +954,20 @@
                 <w:sz w:val="20"/>
                 <w:szCs w:val="20"/>
               </w:rPr>
-              <w:t>Header / Identification</w:t>
-            </w:r>
+              <w:t xml:space="preserve">Header / </w:t>
+            </w:r>
+            <w:proofErr w:type="spellStart"/>
+            <w:r>
+              <w:rPr>
+                <w:rFonts w:ascii="Times New Roman" w:hAnsi="Times New Roman" w:cs="Times New Roman"/>
+                <w:i/>
+                <w:iCs/>
+                <w:sz w:val="20"/>
+                <w:szCs w:val="20"/>
+              </w:rPr>
+              <w:t>Identification</w:t>
+            </w:r>
+            <w:proofErr w:type="spellEnd"/>
           </w:p>
         </w:tc>
         <w:tc>
@@ -1101,6 +1105,7 @@
                 <w:szCs w:val="20"/>
               </w:rPr>
             </w:pPr>
+            <w:proofErr w:type="spellStart"/>
             <w:r>
               <w:rPr>
                 <w:rFonts w:ascii="Times New Roman" w:hAnsi="Times New Roman" w:cs="Times New Roman"/>
@@ -1109,8 +1114,31 @@
                 <w:sz w:val="20"/>
                 <w:szCs w:val="20"/>
               </w:rPr>
-              <w:t>Filters / Navigation</w:t>
-            </w:r>
+              <w:t>Filters</w:t>
+            </w:r>
+            <w:proofErr w:type="spellEnd"/>
+            <w:r>
+              <w:rPr>
+                <w:rFonts w:ascii="Times New Roman" w:hAnsi="Times New Roman" w:cs="Times New Roman"/>
+                <w:i/>
+                <w:iCs/>
+                <w:sz w:val="20"/>
+                <w:szCs w:val="20"/>
+              </w:rPr>
+              <w:t xml:space="preserve"> / </w:t>
+            </w:r>
+            <w:proofErr w:type="spellStart"/>
+            <w:r>
+              <w:rPr>
+                <w:rFonts w:ascii="Times New Roman" w:hAnsi="Times New Roman" w:cs="Times New Roman"/>
+                <w:i/>
+                <w:iCs/>
+                <w:sz w:val="20"/>
+                <w:szCs w:val="20"/>
+              </w:rPr>
+              <w:t>Navigation</w:t>
+            </w:r>
+            <w:proofErr w:type="spellEnd"/>
           </w:p>
         </w:tc>
         <w:tc>
@@ -1187,16 +1215,9 @@
                 <w:szCs w:val="20"/>
               </w:rPr>
               <w:lastRenderedPageBreak/>
-              <w:t>Branch Type, Branch Name</w:t>
-            </w:r>
-            <w:r>
-              <w:rPr>
-                <w:rFonts w:ascii="Times New Roman" w:hAnsi="Times New Roman" w:cs="Times New Roman"/>
-                <w:sz w:val="20"/>
-                <w:szCs w:val="20"/>
-              </w:rPr>
-              <w:t xml:space="preserve"> e </w:t>
-            </w:r>
+              <w:t xml:space="preserve">Branch </w:t>
+            </w:r>
+            <w:proofErr w:type="spellStart"/>
             <w:r>
               <w:rPr>
                 <w:rFonts w:ascii="Times New Roman" w:hAnsi="Times New Roman" w:cs="Times New Roman"/>
@@ -1205,7 +1226,48 @@
                 <w:sz w:val="20"/>
                 <w:szCs w:val="20"/>
               </w:rPr>
-              <w:t>Transaction Name</w:t>
+              <w:t>Type</w:t>
+            </w:r>
+            <w:proofErr w:type="spellEnd"/>
+            <w:r>
+              <w:rPr>
+                <w:rFonts w:ascii="Times New Roman" w:hAnsi="Times New Roman" w:cs="Times New Roman"/>
+                <w:i/>
+                <w:iCs/>
+                <w:sz w:val="20"/>
+                <w:szCs w:val="20"/>
+              </w:rPr>
+              <w:t>, Branch Name</w:t>
+            </w:r>
+            <w:r>
+              <w:rPr>
+                <w:rFonts w:ascii="Times New Roman" w:hAnsi="Times New Roman" w:cs="Times New Roman"/>
+                <w:sz w:val="20"/>
+                <w:szCs w:val="20"/>
+              </w:rPr>
+              <w:t xml:space="preserve"> e </w:t>
+            </w:r>
+            <w:proofErr w:type="spellStart"/>
+            <w:r>
+              <w:rPr>
+                <w:rFonts w:ascii="Times New Roman" w:hAnsi="Times New Roman" w:cs="Times New Roman"/>
+                <w:i/>
+                <w:iCs/>
+                <w:sz w:val="20"/>
+                <w:szCs w:val="20"/>
+              </w:rPr>
+              <w:t>Transaction</w:t>
+            </w:r>
+            <w:proofErr w:type="spellEnd"/>
+            <w:r>
+              <w:rPr>
+                <w:rFonts w:ascii="Times New Roman" w:hAnsi="Times New Roman" w:cs="Times New Roman"/>
+                <w:i/>
+                <w:iCs/>
+                <w:sz w:val="20"/>
+                <w:szCs w:val="20"/>
+              </w:rPr>
+              <w:t xml:space="preserve"> Name</w:t>
             </w:r>
           </w:p>
         </w:tc>
@@ -1309,7 +1371,29 @@
                 <w:sz w:val="20"/>
                 <w:szCs w:val="20"/>
               </w:rPr>
-              <w:t>Key Performance Indicators (KPIs)</w:t>
+              <w:t xml:space="preserve">Key Performance </w:t>
+            </w:r>
+            <w:proofErr w:type="spellStart"/>
+            <w:r>
+              <w:rPr>
+                <w:rFonts w:ascii="Times New Roman" w:hAnsi="Times New Roman" w:cs="Times New Roman"/>
+                <w:i/>
+                <w:iCs/>
+                <w:sz w:val="20"/>
+                <w:szCs w:val="20"/>
+              </w:rPr>
+              <w:t>Indicators</w:t>
+            </w:r>
+            <w:proofErr w:type="spellEnd"/>
+            <w:r>
+              <w:rPr>
+                <w:rFonts w:ascii="Times New Roman" w:hAnsi="Times New Roman" w:cs="Times New Roman"/>
+                <w:i/>
+                <w:iCs/>
+                <w:sz w:val="20"/>
+                <w:szCs w:val="20"/>
+              </w:rPr>
+              <w:t xml:space="preserve"> (KPIs)</w:t>
             </w:r>
           </w:p>
         </w:tc>
@@ -1511,6 +1595,7 @@
                 <w:szCs w:val="20"/>
               </w:rPr>
             </w:pPr>
+            <w:proofErr w:type="spellStart"/>
             <w:r>
               <w:rPr>
                 <w:rFonts w:ascii="Times New Roman" w:hAnsi="Times New Roman" w:cs="Times New Roman"/>
@@ -1519,8 +1604,31 @@
                 <w:sz w:val="20"/>
                 <w:szCs w:val="20"/>
               </w:rPr>
-              <w:t>Analytical Visualizations</w:t>
-            </w:r>
+              <w:t>Analytical</w:t>
+            </w:r>
+            <w:proofErr w:type="spellEnd"/>
+            <w:r>
+              <w:rPr>
+                <w:rFonts w:ascii="Times New Roman" w:hAnsi="Times New Roman" w:cs="Times New Roman"/>
+                <w:i/>
+                <w:iCs/>
+                <w:sz w:val="20"/>
+                <w:szCs w:val="20"/>
+              </w:rPr>
+              <w:t xml:space="preserve"> </w:t>
+            </w:r>
+            <w:proofErr w:type="spellStart"/>
+            <w:r>
+              <w:rPr>
+                <w:rFonts w:ascii="Times New Roman" w:hAnsi="Times New Roman" w:cs="Times New Roman"/>
+                <w:i/>
+                <w:iCs/>
+                <w:sz w:val="20"/>
+                <w:szCs w:val="20"/>
+              </w:rPr>
+              <w:t>Visualizations</w:t>
+            </w:r>
+            <w:proofErr w:type="spellEnd"/>
           </w:p>
         </w:tc>
         <w:tc>
@@ -1632,7 +1740,15 @@
           <w:i/>
           <w:iCs/>
         </w:rPr>
-        <w:t>Mockup</w:t>
+        <w:t>m</w:t>
+      </w:r>
+      <w:r>
+        <w:rPr>
+          <w:rFonts w:ascii="Times New Roman" w:hAnsi="Times New Roman" w:cs="Times New Roman"/>
+          <w:i/>
+          <w:iCs/>
+        </w:rPr>
+        <w:t>ockup</w:t>
       </w:r>
       <w:r>
         <w:rPr>
@@ -1837,6 +1953,7 @@
       </w:r>
     </w:p>
     <w:p/>
+    <w:p/>
     <w:p>
       <w:pPr>
         <w:pStyle w:val="ListParagraph"/>
@@ -1858,6 +1975,7 @@
           <w:b/>
           <w:bCs/>
         </w:rPr>
+        <w:lastRenderedPageBreak/>
         <w:t xml:space="preserve">Leitura complementar da região 3 </w:t>
       </w:r>
     </w:p>
@@ -1874,7 +1992,6 @@
         <w:rPr>
           <w:rFonts w:ascii="Times New Roman" w:hAnsi="Times New Roman" w:cs="Times New Roman"/>
         </w:rPr>
-        <w:lastRenderedPageBreak/>
         <w:t xml:space="preserve">Essa região reúne os principais KPIs comerciais do BanVic solicitados pelo time comercial e pela diretora comercial Camila Diniz. </w:t>
       </w:r>
       <w:r>
@@ -1883,21 +2000,41 @@
           <w:i/>
           <w:iCs/>
         </w:rPr>
-        <w:t>Active Customers</w:t>
-      </w:r>
+        <w:t xml:space="preserve">Active </w:t>
+      </w:r>
+      <w:proofErr w:type="spellStart"/>
+      <w:r>
+        <w:rPr>
+          <w:rFonts w:ascii="Times New Roman" w:hAnsi="Times New Roman" w:cs="Times New Roman"/>
+          <w:i/>
+          <w:iCs/>
+        </w:rPr>
+        <w:t>Customers</w:t>
+      </w:r>
+      <w:proofErr w:type="spellEnd"/>
       <w:r>
         <w:rPr>
           <w:rFonts w:ascii="Times New Roman" w:hAnsi="Times New Roman" w:cs="Times New Roman"/>
         </w:rPr>
         <w:t xml:space="preserve"> mede o engajamento da base, </w:t>
       </w:r>
-      <w:r>
-        <w:rPr>
-          <w:rFonts w:ascii="Times New Roman" w:hAnsi="Times New Roman" w:cs="Times New Roman"/>
-          <w:i/>
-          <w:iCs/>
-        </w:rPr>
-        <w:t>Churn Rate</w:t>
+      <w:proofErr w:type="spellStart"/>
+      <w:r>
+        <w:rPr>
+          <w:rFonts w:ascii="Times New Roman" w:hAnsi="Times New Roman" w:cs="Times New Roman"/>
+          <w:i/>
+          <w:iCs/>
+        </w:rPr>
+        <w:t>Churn</w:t>
+      </w:r>
+      <w:proofErr w:type="spellEnd"/>
+      <w:r>
+        <w:rPr>
+          <w:rFonts w:ascii="Times New Roman" w:hAnsi="Times New Roman" w:cs="Times New Roman"/>
+          <w:i/>
+          <w:iCs/>
+        </w:rPr>
+        <w:t xml:space="preserve"> Rate</w:t>
       </w:r>
       <w:r>
         <w:rPr>
@@ -1905,13 +2042,41 @@
         </w:rPr>
         <w:t xml:space="preserve"> acompanha a perda de clientes ativos, </w:t>
       </w:r>
-      <w:r>
-        <w:rPr>
-          <w:rFonts w:ascii="Times New Roman" w:hAnsi="Times New Roman" w:cs="Times New Roman"/>
-          <w:i/>
-          <w:iCs/>
-        </w:rPr>
-        <w:t>Avg New Customers per Year</w:t>
+      <w:proofErr w:type="spellStart"/>
+      <w:r>
+        <w:rPr>
+          <w:rFonts w:ascii="Times New Roman" w:hAnsi="Times New Roman" w:cs="Times New Roman"/>
+          <w:i/>
+          <w:iCs/>
+        </w:rPr>
+        <w:t>Avg</w:t>
+      </w:r>
+      <w:proofErr w:type="spellEnd"/>
+      <w:r>
+        <w:rPr>
+          <w:rFonts w:ascii="Times New Roman" w:hAnsi="Times New Roman" w:cs="Times New Roman"/>
+          <w:i/>
+          <w:iCs/>
+        </w:rPr>
+        <w:t xml:space="preserve"> New </w:t>
+      </w:r>
+      <w:proofErr w:type="spellStart"/>
+      <w:r>
+        <w:rPr>
+          <w:rFonts w:ascii="Times New Roman" w:hAnsi="Times New Roman" w:cs="Times New Roman"/>
+          <w:i/>
+          <w:iCs/>
+        </w:rPr>
+        <w:t>Customers</w:t>
+      </w:r>
+      <w:proofErr w:type="spellEnd"/>
+      <w:r>
+        <w:rPr>
+          <w:rFonts w:ascii="Times New Roman" w:hAnsi="Times New Roman" w:cs="Times New Roman"/>
+          <w:i/>
+          <w:iCs/>
+        </w:rPr>
+        <w:t xml:space="preserve"> per Year</w:t>
       </w:r>
       <w:r>
         <w:rPr>
@@ -1925,22 +2090,70 @@
           <w:i/>
           <w:iCs/>
         </w:rPr>
-        <w:t>Total Transactions</w:t>
-      </w:r>
+        <w:t xml:space="preserve">Total </w:t>
+      </w:r>
+      <w:proofErr w:type="spellStart"/>
+      <w:r>
+        <w:rPr>
+          <w:rFonts w:ascii="Times New Roman" w:hAnsi="Times New Roman" w:cs="Times New Roman"/>
+          <w:i/>
+          <w:iCs/>
+        </w:rPr>
+        <w:t>Transactions</w:t>
+      </w:r>
+      <w:proofErr w:type="spellEnd"/>
       <w:r>
         <w:rPr>
           <w:rFonts w:ascii="Times New Roman" w:hAnsi="Times New Roman" w:cs="Times New Roman"/>
         </w:rPr>
         <w:t xml:space="preserve"> representa o volume de operações e </w:t>
       </w:r>
-      <w:r>
-        <w:rPr>
-          <w:rFonts w:ascii="Times New Roman" w:hAnsi="Times New Roman" w:cs="Times New Roman"/>
-          <w:i/>
-          <w:iCs/>
-        </w:rPr>
-        <w:t>Avg Transaction Value</w:t>
-      </w:r>
+      <w:proofErr w:type="spellStart"/>
+      <w:r>
+        <w:rPr>
+          <w:rFonts w:ascii="Times New Roman" w:hAnsi="Times New Roman" w:cs="Times New Roman"/>
+          <w:i/>
+          <w:iCs/>
+        </w:rPr>
+        <w:t>Avg</w:t>
+      </w:r>
+      <w:proofErr w:type="spellEnd"/>
+      <w:r>
+        <w:rPr>
+          <w:rFonts w:ascii="Times New Roman" w:hAnsi="Times New Roman" w:cs="Times New Roman"/>
+          <w:i/>
+          <w:iCs/>
+        </w:rPr>
+        <w:t xml:space="preserve"> </w:t>
+      </w:r>
+      <w:proofErr w:type="spellStart"/>
+      <w:r>
+        <w:rPr>
+          <w:rFonts w:ascii="Times New Roman" w:hAnsi="Times New Roman" w:cs="Times New Roman"/>
+          <w:i/>
+          <w:iCs/>
+        </w:rPr>
+        <w:t>Transaction</w:t>
+      </w:r>
+      <w:proofErr w:type="spellEnd"/>
+      <w:r>
+        <w:rPr>
+          <w:rFonts w:ascii="Times New Roman" w:hAnsi="Times New Roman" w:cs="Times New Roman"/>
+          <w:i/>
+          <w:iCs/>
+        </w:rPr>
+        <w:t xml:space="preserve"> </w:t>
+      </w:r>
+      <w:proofErr w:type="spellStart"/>
+      <w:r>
+        <w:rPr>
+          <w:rFonts w:ascii="Times New Roman" w:hAnsi="Times New Roman" w:cs="Times New Roman"/>
+          <w:i/>
+          <w:iCs/>
+        </w:rPr>
+        <w:t>Value</w:t>
+      </w:r>
+      <w:proofErr w:type="spellEnd"/>
       <w:r>
         <w:rPr>
           <w:rFonts w:ascii="Times New Roman" w:hAnsi="Times New Roman" w:cs="Times New Roman"/>
@@ -2021,21 +2234,59 @@
           <w:i/>
           <w:iCs/>
         </w:rPr>
-        <w:t>Active vs. Inactive Customers</w:t>
-      </w:r>
+        <w:t xml:space="preserve">Active vs. </w:t>
+      </w:r>
+      <w:proofErr w:type="spellStart"/>
+      <w:r>
+        <w:rPr>
+          <w:rFonts w:ascii="Times New Roman" w:hAnsi="Times New Roman" w:cs="Times New Roman"/>
+          <w:i/>
+          <w:iCs/>
+        </w:rPr>
+        <w:t>Inactive</w:t>
+      </w:r>
+      <w:proofErr w:type="spellEnd"/>
+      <w:r>
+        <w:rPr>
+          <w:rFonts w:ascii="Times New Roman" w:hAnsi="Times New Roman" w:cs="Times New Roman"/>
+          <w:i/>
+          <w:iCs/>
+        </w:rPr>
+        <w:t xml:space="preserve"> </w:t>
+      </w:r>
+      <w:proofErr w:type="spellStart"/>
+      <w:r>
+        <w:rPr>
+          <w:rFonts w:ascii="Times New Roman" w:hAnsi="Times New Roman" w:cs="Times New Roman"/>
+          <w:i/>
+          <w:iCs/>
+        </w:rPr>
+        <w:t>Customers</w:t>
+      </w:r>
+      <w:proofErr w:type="spellEnd"/>
       <w:r>
         <w:rPr>
           <w:rFonts w:ascii="Times New Roman" w:hAnsi="Times New Roman" w:cs="Times New Roman"/>
         </w:rPr>
         <w:t xml:space="preserve"> acompanha a evolução do engajamento da base e ajuda a contextualizar o indicador de clientes ativos. </w:t>
       </w:r>
-      <w:r>
-        <w:rPr>
-          <w:rFonts w:ascii="Times New Roman" w:hAnsi="Times New Roman" w:cs="Times New Roman"/>
-          <w:i/>
-          <w:iCs/>
-        </w:rPr>
-        <w:t>Transaction Evolution</w:t>
+      <w:proofErr w:type="spellStart"/>
+      <w:r>
+        <w:rPr>
+          <w:rFonts w:ascii="Times New Roman" w:hAnsi="Times New Roman" w:cs="Times New Roman"/>
+          <w:i/>
+          <w:iCs/>
+        </w:rPr>
+        <w:t>Transaction</w:t>
+      </w:r>
+      <w:proofErr w:type="spellEnd"/>
+      <w:r>
+        <w:rPr>
+          <w:rFonts w:ascii="Times New Roman" w:hAnsi="Times New Roman" w:cs="Times New Roman"/>
+          <w:i/>
+          <w:iCs/>
+        </w:rPr>
+        <w:t xml:space="preserve"> Evolution</w:t>
       </w:r>
       <w:r>
         <w:rPr>
@@ -2065,8 +2316,36 @@
           <w:i/>
           <w:iCs/>
         </w:rPr>
-        <w:t>Digital vs. Physical Branches</w:t>
-      </w:r>
+        <w:t xml:space="preserve">Digital vs. </w:t>
+      </w:r>
+      <w:proofErr w:type="spellStart"/>
+      <w:r>
+        <w:rPr>
+          <w:rFonts w:ascii="Times New Roman" w:hAnsi="Times New Roman" w:cs="Times New Roman"/>
+          <w:i/>
+          <w:iCs/>
+        </w:rPr>
+        <w:t>Physical</w:t>
+      </w:r>
+      <w:proofErr w:type="spellEnd"/>
+      <w:r>
+        <w:rPr>
+          <w:rFonts w:ascii="Times New Roman" w:hAnsi="Times New Roman" w:cs="Times New Roman"/>
+          <w:i/>
+          <w:iCs/>
+        </w:rPr>
+        <w:t xml:space="preserve"> </w:t>
+      </w:r>
+      <w:proofErr w:type="spellStart"/>
+      <w:r>
+        <w:rPr>
+          <w:rFonts w:ascii="Times New Roman" w:hAnsi="Times New Roman" w:cs="Times New Roman"/>
+          <w:i/>
+          <w:iCs/>
+        </w:rPr>
+        <w:t>Branches</w:t>
+      </w:r>
+      <w:proofErr w:type="spellEnd"/>
       <w:r>
         <w:rPr>
           <w:rFonts w:ascii="Times New Roman" w:hAnsi="Times New Roman" w:cs="Times New Roman"/>
@@ -2099,13 +2378,59 @@
         </w:rPr>
         <w:t xml:space="preserve">. Por fim, </w:t>
       </w:r>
-      <w:r>
-        <w:rPr>
-          <w:rFonts w:ascii="Times New Roman" w:hAnsi="Times New Roman" w:cs="Times New Roman"/>
-          <w:i/>
-          <w:iCs/>
-        </w:rPr>
-        <w:t>Credit Proposals by Status</w:t>
+      <w:proofErr w:type="spellStart"/>
+      <w:r>
+        <w:rPr>
+          <w:rFonts w:ascii="Times New Roman" w:hAnsi="Times New Roman" w:cs="Times New Roman"/>
+          <w:i/>
+          <w:iCs/>
+        </w:rPr>
+        <w:t>Credit</w:t>
+      </w:r>
+      <w:proofErr w:type="spellEnd"/>
+      <w:r>
+        <w:rPr>
+          <w:rFonts w:ascii="Times New Roman" w:hAnsi="Times New Roman" w:cs="Times New Roman"/>
+          <w:i/>
+          <w:iCs/>
+        </w:rPr>
+        <w:t xml:space="preserve"> </w:t>
+      </w:r>
+      <w:proofErr w:type="spellStart"/>
+      <w:r>
+        <w:rPr>
+          <w:rFonts w:ascii="Times New Roman" w:hAnsi="Times New Roman" w:cs="Times New Roman"/>
+          <w:i/>
+          <w:iCs/>
+        </w:rPr>
+        <w:t>Proposals</w:t>
+      </w:r>
+      <w:proofErr w:type="spellEnd"/>
+      <w:r>
+        <w:rPr>
+          <w:rFonts w:ascii="Times New Roman" w:hAnsi="Times New Roman" w:cs="Times New Roman"/>
+          <w:i/>
+          <w:iCs/>
+        </w:rPr>
+        <w:t xml:space="preserve"> </w:t>
+      </w:r>
+      <w:proofErr w:type="spellStart"/>
+      <w:r>
+        <w:rPr>
+          <w:rFonts w:ascii="Times New Roman" w:hAnsi="Times New Roman" w:cs="Times New Roman"/>
+          <w:i/>
+          <w:iCs/>
+        </w:rPr>
+        <w:t>by</w:t>
+      </w:r>
+      <w:proofErr w:type="spellEnd"/>
+      <w:r>
+        <w:rPr>
+          <w:rFonts w:ascii="Times New Roman" w:hAnsi="Times New Roman" w:cs="Times New Roman"/>
+          <w:i/>
+          <w:iCs/>
+        </w:rPr>
+        <w:t xml:space="preserve"> Status</w:t>
       </w:r>
       <w:r>
         <w:rPr>
@@ -2382,7 +2707,21 @@
         <w:rPr>
           <w:rFonts w:ascii="Times New Roman" w:hAnsi="Times New Roman" w:cs="Times New Roman"/>
         </w:rPr>
-        <w:t xml:space="preserve">O churn segue movimento inverso. Conforme a definição adotada na análise </w:t>
+        <w:t xml:space="preserve">O </w:t>
+      </w:r>
+      <w:proofErr w:type="spellStart"/>
+      <w:r>
+        <w:rPr>
+          <w:rFonts w:ascii="Times New Roman" w:hAnsi="Times New Roman" w:cs="Times New Roman"/>
+        </w:rPr>
+        <w:t>churn</w:t>
+      </w:r>
+      <w:proofErr w:type="spellEnd"/>
+      <w:r>
+        <w:rPr>
+          <w:rFonts w:ascii="Times New Roman" w:hAnsi="Times New Roman" w:cs="Times New Roman"/>
+        </w:rPr>
+        <w:t xml:space="preserve"> segue movimento inverso. Conforme a definição adotada na análise </w:t>
       </w:r>
       <w:r>
         <w:rPr>

</xml_diff>